<commit_message>
feat: func is triggered via other file
</commit_message>
<xml_diff>
--- a/lab1/Report.docx
+++ b/lab1/Report.docx
@@ -955,6 +955,7 @@
           <w:rFonts w:ascii="Times New Roman" w:hAnsi="Times New Roman" w:cs="Times New Roman"/>
           <w:i/>
           <w:iCs/>
+          <w:noProof/>
           <w:sz w:val="24"/>
           <w:szCs w:val="24"/>
         </w:rPr>
@@ -1042,6 +1043,7 @@
           <w:rFonts w:ascii="Times New Roman" w:hAnsi="Times New Roman" w:cs="Times New Roman"/>
           <w:i/>
           <w:iCs/>
+          <w:noProof/>
           <w:sz w:val="24"/>
           <w:szCs w:val="24"/>
         </w:rPr>
@@ -1132,10 +1134,10 @@
           <w:szCs w:val="24"/>
         </w:rPr>
         <w:drawing>
-          <wp:inline distT="0" distB="0" distL="0" distR="0" wp14:anchorId="15C96242" wp14:editId="6DFC2BD6">
-            <wp:extent cx="3522003" cy="1952625"/>
-            <wp:effectExtent l="0" t="0" r="2540" b="0"/>
-            <wp:docPr id="836399940" name="Рисунок 1" descr="Изображение выглядит как текст, снимок экрана, Шрифт&#10;&#10;Автоматически созданное описание"/>
+          <wp:inline distT="0" distB="0" distL="0" distR="0" wp14:anchorId="4108F5D3" wp14:editId="09AAC359">
+            <wp:extent cx="3362794" cy="1971950"/>
+            <wp:effectExtent l="0" t="0" r="9525" b="9525"/>
+            <wp:docPr id="1853399068" name="Рисунок 1" descr="Изображение выглядит как текст, снимок экрана, Шрифт&#10;&#10;Автоматически созданное описание"/>
             <wp:cNvGraphicFramePr>
               <a:graphicFrameLocks xmlns:a="http://schemas.openxmlformats.org/drawingml/2006/main" noChangeAspect="1"/>
             </wp:cNvGraphicFramePr>
@@ -1143,7 +1145,7 @@
               <a:graphicData uri="http://schemas.openxmlformats.org/drawingml/2006/picture">
                 <pic:pic xmlns:pic="http://schemas.openxmlformats.org/drawingml/2006/picture">
                   <pic:nvPicPr>
-                    <pic:cNvPr id="836399940" name="Рисунок 1" descr="Изображение выглядит как текст, снимок экрана, Шрифт&#10;&#10;Автоматически созданное описание"/>
+                    <pic:cNvPr id="1853399068" name="Рисунок 1" descr="Изображение выглядит как текст, снимок экрана, Шрифт&#10;&#10;Автоматически созданное описание"/>
                     <pic:cNvPicPr/>
                   </pic:nvPicPr>
                   <pic:blipFill>
@@ -1155,7 +1157,7 @@
                   <pic:spPr>
                     <a:xfrm>
                       <a:off x="0" y="0"/>
-                      <a:ext cx="3536770" cy="1960812"/>
+                      <a:ext cx="3362794" cy="1971950"/>
                     </a:xfrm>
                     <a:prstGeom prst="rect">
                       <a:avLst/>
@@ -1362,7 +1364,6 @@
           <w:rFonts w:ascii="Times New Roman" w:hAnsi="Times New Roman" w:cs="Times New Roman"/>
           <w:sz w:val="24"/>
           <w:szCs w:val="24"/>
-          <w:lang w:val="en-US"/>
         </w:rPr>
       </w:pPr>
       <w:r>

</xml_diff>